<commit_message>
FYC-23 : charte d'export de base et largeurs de colonnes des tableaux
reference.docx : Arial 11, titres en bleu marine, tableaux avec bordures,
en-tête grisée en gras, texte de tableau en 10 pt. Scénarisation : les
lignes de séparation des tableaux donnent des proportions de colonnes
lisibles (pandoc les utilise quand le tableau dépasse la page).

Co-Authored-By: Claude Fable 5.1 <noreply@anthropic.com>
Claude-Session: https://claude.ai/code/session_014GLS1vnL6C5svPjRXKgnbw
</commit_message>
<xml_diff>
--- a/charte/reference.docx
+++ b/charte/reference.docx
@@ -485,10 +485,10 @@
   <w:docDefaults>
     <w:rPrDefault>
       <w:rPr>
-        <w:rFonts w:asciiTheme="minorHAnsi" w:eastAsiaTheme="minorEastAsia" w:hAnsiTheme="minorHAnsi" w:cstheme="minorBidi"/>
-        <w:sz w:val="24"/>
-        <w:szCs w:val="24"/>
-        <w:lang w:val="en-US" w:eastAsia="zh-CN" w:bidi="ar-SA"/>
+        <w:rFonts w:ascii="Arial" w:hAnsi="Arial" w:eastAsia="Arial" w:cs="Arial"/>
+        <w:sz w:val="22"/>
+        <w:szCs w:val="22"/>
+        <w:lang w:val="fr-FR" w:eastAsia="fr-FR" w:bidi="ar-SA"/>
       </w:rPr>
     </w:rPrDefault>
     <w:pPrDefault>
@@ -524,6 +524,10 @@
     <w:pPr>
       <w:spacing w:before="36" w:after="36"/>
     </w:pPr>
+    <w:rPr>
+      <w:sz w:val="20"/>
+      <w:szCs w:val="20"/>
+    </w:rPr>
   </w:style>
   <w:style w:type="paragraph" w:styleId="Title">
     <w:name w:val="Title"/>
@@ -539,9 +543,11 @@
       <w:jc w:val="center"/>
     </w:pPr>
     <w:rPr>
-      <w:rFonts w:asciiTheme="majorHAnsi" w:eastAsiaTheme="majorEastAsia" w:hAnsiTheme="majorHAnsi" w:cstheme="majorBidi"/>
-      <w:sz w:val="56"/>
-      <w:szCs w:val="56"/>
+      <w:rFonts w:ascii="Arial" w:hAnsi="Arial" w:eastAsia="Arial" w:cs="Arial"/>
+      <w:b/>
+      <w:color w:val="0B2A4A"/>
+      <w:sz w:val="40"/>
+      <w:szCs w:val="40"/>
     </w:rPr>
   </w:style>
   <w:style w:type="character" w:customStyle="1" w:styleId="TitleChar">
@@ -673,28 +679,215 @@
       <w:outlineLvl w:val="0"/>
     </w:pPr>
     <w:rPr>
+      <w:rFonts w:ascii="Arial" w:hAnsi="Arial" w:eastAsia="Arial" w:cs="Arial"/>
+      <w:b/>
+      <w:color w:val="0B2A4A"/>
+      <w:sz w:val="32"/>
+      <w:szCs w:val="32"/>
+    </w:rPr>
+  </w:style>
+  <w:style w:type="paragraph" w:styleId="Heading2">
+    <w:name w:val="heading 2"/>
+    <w:basedOn w:val="Normal"/>
+    <w:next w:val="BodyText"/>
+    <w:link w:val="Heading2Char"/>
+    <w:uiPriority w:val="9"/>
+    <w:semiHidden/>
+    <w:unhideWhenUsed/>
+    <w:qFormat/>
+    <w:rsid w:val="00A10FD9"/>
+    <w:pPr>
+      <w:keepNext/>
+      <w:keepLines/>
+      <w:spacing w:before="160" w:after="80"/>
+      <w:outlineLvl w:val="1"/>
+    </w:pPr>
+    <w:rPr>
+      <w:rFonts w:ascii="Arial" w:hAnsi="Arial" w:eastAsia="Arial" w:cs="Arial"/>
+      <w:b/>
+      <w:color w:val="0B2A4A"/>
+      <w:sz w:val="26"/>
+      <w:szCs w:val="26"/>
+    </w:rPr>
+  </w:style>
+  <w:style w:type="paragraph" w:styleId="Heading3">
+    <w:name w:val="heading 3"/>
+    <w:basedOn w:val="Normal"/>
+    <w:next w:val="BodyText"/>
+    <w:link w:val="Heading3Char"/>
+    <w:uiPriority w:val="9"/>
+    <w:semiHidden/>
+    <w:unhideWhenUsed/>
+    <w:qFormat/>
+    <w:rsid w:val="00A10FD9"/>
+    <w:pPr>
+      <w:keepNext/>
+      <w:keepLines/>
+      <w:spacing w:before="160" w:after="80"/>
+      <w:outlineLvl w:val="2"/>
+    </w:pPr>
+    <w:rPr>
+      <w:rFonts w:ascii="Arial" w:hAnsi="Arial" w:eastAsia="Arial" w:cs="Arial"/>
+      <w:b/>
+      <w:color w:val="0B2A4A"/>
+      <w:sz w:val="22"/>
+      <w:szCs w:val="22"/>
+    </w:rPr>
+  </w:style>
+  <w:style w:type="paragraph" w:styleId="Heading4">
+    <w:name w:val="heading 4"/>
+    <w:basedOn w:val="Normal"/>
+    <w:next w:val="BodyText"/>
+    <w:link w:val="Heading4Char"/>
+    <w:uiPriority w:val="9"/>
+    <w:semiHidden/>
+    <w:unhideWhenUsed/>
+    <w:qFormat/>
+    <w:rsid w:val="00A10FD9"/>
+    <w:pPr>
+      <w:keepNext/>
+      <w:keepLines/>
+      <w:spacing w:before="80" w:after="40"/>
+      <w:outlineLvl w:val="3"/>
+    </w:pPr>
+    <w:rPr>
+      <w:rFonts w:ascii="Arial" w:hAnsi="Arial" w:eastAsia="Arial" w:cs="Arial"/>
+      <w:b/>
+      <w:i/>
+      <w:color w:val="0B2A4A"/>
+      <w:sz w:val="22"/>
+      <w:szCs w:val="22"/>
+    </w:rPr>
+  </w:style>
+  <w:style w:type="paragraph" w:styleId="Heading5">
+    <w:name w:val="heading 5"/>
+    <w:basedOn w:val="Normal"/>
+    <w:next w:val="BodyText"/>
+    <w:link w:val="Heading5Char"/>
+    <w:uiPriority w:val="9"/>
+    <w:semiHidden/>
+    <w:unhideWhenUsed/>
+    <w:qFormat/>
+    <w:rsid w:val="00A10FD9"/>
+    <w:pPr>
+      <w:keepNext/>
+      <w:keepLines/>
+      <w:spacing w:before="80" w:after="40"/>
+      <w:outlineLvl w:val="4"/>
+    </w:pPr>
+    <w:rPr>
+      <w:rFonts w:eastAsiaTheme="majorEastAsia" w:cstheme="majorBidi"/>
+      <w:color w:val="0F4761" w:themeColor="accent1" w:themeShade="BF"/>
+    </w:rPr>
+  </w:style>
+  <w:style w:type="paragraph" w:styleId="Heading6">
+    <w:name w:val="heading 6"/>
+    <w:basedOn w:val="Normal"/>
+    <w:next w:val="BodyText"/>
+    <w:link w:val="Heading6Char"/>
+    <w:uiPriority w:val="9"/>
+    <w:semiHidden/>
+    <w:unhideWhenUsed/>
+    <w:qFormat/>
+    <w:rsid w:val="00A10FD9"/>
+    <w:pPr>
+      <w:keepNext/>
+      <w:keepLines/>
+      <w:spacing w:before="40" w:after="0"/>
+      <w:outlineLvl w:val="5"/>
+    </w:pPr>
+    <w:rPr>
+      <w:rFonts w:eastAsiaTheme="majorEastAsia" w:cstheme="majorBidi"/>
+      <w:i/>
+      <w:iCs/>
+      <w:color w:val="595959" w:themeColor="text1" w:themeTint="A6"/>
+    </w:rPr>
+  </w:style>
+  <w:style w:type="paragraph" w:styleId="Heading7">
+    <w:name w:val="heading 7"/>
+    <w:basedOn w:val="Normal"/>
+    <w:next w:val="BodyText"/>
+    <w:link w:val="Heading7Char"/>
+    <w:uiPriority w:val="9"/>
+    <w:semiHidden/>
+    <w:unhideWhenUsed/>
+    <w:qFormat/>
+    <w:rsid w:val="00A10FD9"/>
+    <w:pPr>
+      <w:keepNext/>
+      <w:keepLines/>
+      <w:spacing w:before="40" w:after="0"/>
+      <w:outlineLvl w:val="6"/>
+    </w:pPr>
+    <w:rPr>
+      <w:rFonts w:eastAsiaTheme="majorEastAsia" w:cstheme="majorBidi"/>
+      <w:color w:val="595959" w:themeColor="text1" w:themeTint="A6"/>
+    </w:rPr>
+  </w:style>
+  <w:style w:type="paragraph" w:styleId="Heading8">
+    <w:name w:val="heading 8"/>
+    <w:basedOn w:val="Normal"/>
+    <w:next w:val="BodyText"/>
+    <w:link w:val="Heading8Char"/>
+    <w:uiPriority w:val="9"/>
+    <w:semiHidden/>
+    <w:unhideWhenUsed/>
+    <w:qFormat/>
+    <w:rsid w:val="00A10FD9"/>
+    <w:pPr>
+      <w:keepNext/>
+      <w:keepLines/>
+      <w:spacing w:after="0"/>
+      <w:outlineLvl w:val="7"/>
+    </w:pPr>
+    <w:rPr>
+      <w:rFonts w:eastAsiaTheme="majorEastAsia" w:cstheme="majorBidi"/>
+      <w:i/>
+      <w:iCs/>
+      <w:color w:val="272727" w:themeColor="text1" w:themeTint="D8"/>
+    </w:rPr>
+  </w:style>
+  <w:style w:type="paragraph" w:styleId="Heading9">
+    <w:name w:val="heading 9"/>
+    <w:basedOn w:val="Normal"/>
+    <w:next w:val="BodyText"/>
+    <w:link w:val="Heading9Char"/>
+    <w:uiPriority w:val="9"/>
+    <w:semiHidden/>
+    <w:unhideWhenUsed/>
+    <w:qFormat/>
+    <w:rsid w:val="00A10FD9"/>
+    <w:pPr>
+      <w:keepNext/>
+      <w:keepLines/>
+      <w:spacing w:after="0"/>
+      <w:outlineLvl w:val="8"/>
+    </w:pPr>
+    <w:rPr>
+      <w:rFonts w:eastAsiaTheme="majorEastAsia" w:cstheme="majorBidi"/>
+      <w:color w:val="272727" w:themeColor="text1" w:themeTint="D8"/>
+    </w:rPr>
+  </w:style>
+  <w:style w:type="character" w:customStyle="1" w:styleId="Heading1Char">
+    <w:name w:val="Heading 1 Char"/>
+    <w:basedOn w:val="DefaultParagraphFont"/>
+    <w:link w:val="Heading1"/>
+    <w:uiPriority w:val="9"/>
+    <w:rsid w:val="00A10FD9"/>
+    <w:rPr>
       <w:rFonts w:asciiTheme="majorHAnsi" w:eastAsiaTheme="majorEastAsia" w:hAnsiTheme="majorHAnsi" w:cstheme="majorBidi"/>
       <w:color w:val="0F4761" w:themeColor="accent1" w:themeShade="BF"/>
       <w:sz w:val="40"/>
       <w:szCs w:val="40"/>
     </w:rPr>
   </w:style>
-  <w:style w:type="paragraph" w:styleId="Heading2">
-    <w:name w:val="heading 2"/>
-    <w:basedOn w:val="Normal"/>
-    <w:next w:val="BodyText"/>
-    <w:link w:val="Heading2Char"/>
-    <w:uiPriority w:val="9"/>
-    <w:semiHidden/>
-    <w:unhideWhenUsed/>
-    <w:qFormat/>
-    <w:rsid w:val="00A10FD9"/>
-    <w:pPr>
-      <w:keepNext/>
-      <w:keepLines/>
-      <w:spacing w:before="160" w:after="80"/>
-      <w:outlineLvl w:val="1"/>
-    </w:pPr>
+  <w:style w:type="character" w:customStyle="1" w:styleId="Heading2Char">
+    <w:name w:val="Heading 2 Char"/>
+    <w:basedOn w:val="DefaultParagraphFont"/>
+    <w:link w:val="Heading2"/>
+    <w:uiPriority w:val="9"/>
+    <w:semiHidden/>
+    <w:rsid w:val="00A10FD9"/>
     <w:rPr>
       <w:rFonts w:asciiTheme="majorHAnsi" w:eastAsiaTheme="majorEastAsia" w:hAnsiTheme="majorHAnsi" w:cstheme="majorBidi"/>
       <w:color w:val="0F4761" w:themeColor="accent1" w:themeShade="BF"/>
@@ -702,22 +895,13 @@
       <w:szCs w:val="32"/>
     </w:rPr>
   </w:style>
-  <w:style w:type="paragraph" w:styleId="Heading3">
-    <w:name w:val="heading 3"/>
-    <w:basedOn w:val="Normal"/>
-    <w:next w:val="BodyText"/>
-    <w:link w:val="Heading3Char"/>
-    <w:uiPriority w:val="9"/>
-    <w:semiHidden/>
-    <w:unhideWhenUsed/>
-    <w:qFormat/>
-    <w:rsid w:val="00A10FD9"/>
-    <w:pPr>
-      <w:keepNext/>
-      <w:keepLines/>
-      <w:spacing w:before="160" w:after="80"/>
-      <w:outlineLvl w:val="2"/>
-    </w:pPr>
+  <w:style w:type="character" w:customStyle="1" w:styleId="Heading3Char">
+    <w:name w:val="Heading 3 Char"/>
+    <w:basedOn w:val="DefaultParagraphFont"/>
+    <w:link w:val="Heading3"/>
+    <w:uiPriority w:val="9"/>
+    <w:semiHidden/>
+    <w:rsid w:val="00A10FD9"/>
     <w:rPr>
       <w:rFonts w:eastAsiaTheme="majorEastAsia" w:cstheme="majorBidi"/>
       <w:color w:val="0F4761" w:themeColor="accent1" w:themeShade="BF"/>
@@ -725,22 +909,13 @@
       <w:szCs w:val="28"/>
     </w:rPr>
   </w:style>
-  <w:style w:type="paragraph" w:styleId="Heading4">
-    <w:name w:val="heading 4"/>
-    <w:basedOn w:val="Normal"/>
-    <w:next w:val="BodyText"/>
-    <w:link w:val="Heading4Char"/>
-    <w:uiPriority w:val="9"/>
-    <w:semiHidden/>
-    <w:unhideWhenUsed/>
-    <w:qFormat/>
-    <w:rsid w:val="00A10FD9"/>
-    <w:pPr>
-      <w:keepNext/>
-      <w:keepLines/>
-      <w:spacing w:before="80" w:after="40"/>
-      <w:outlineLvl w:val="3"/>
-    </w:pPr>
+  <w:style w:type="character" w:customStyle="1" w:styleId="Heading4Char">
+    <w:name w:val="Heading 4 Char"/>
+    <w:basedOn w:val="DefaultParagraphFont"/>
+    <w:link w:val="Heading4"/>
+    <w:uiPriority w:val="9"/>
+    <w:semiHidden/>
+    <w:rsid w:val="00A10FD9"/>
     <w:rPr>
       <w:rFonts w:eastAsiaTheme="majorEastAsia" w:cstheme="majorBidi"/>
       <w:i/>
@@ -748,43 +923,25 @@
       <w:color w:val="0F4761" w:themeColor="accent1" w:themeShade="BF"/>
     </w:rPr>
   </w:style>
-  <w:style w:type="paragraph" w:styleId="Heading5">
-    <w:name w:val="heading 5"/>
-    <w:basedOn w:val="Normal"/>
-    <w:next w:val="BodyText"/>
-    <w:link w:val="Heading5Char"/>
-    <w:uiPriority w:val="9"/>
-    <w:semiHidden/>
-    <w:unhideWhenUsed/>
-    <w:qFormat/>
-    <w:rsid w:val="00A10FD9"/>
-    <w:pPr>
-      <w:keepNext/>
-      <w:keepLines/>
-      <w:spacing w:before="80" w:after="40"/>
-      <w:outlineLvl w:val="4"/>
-    </w:pPr>
+  <w:style w:type="character" w:customStyle="1" w:styleId="Heading5Char">
+    <w:name w:val="Heading 5 Char"/>
+    <w:basedOn w:val="DefaultParagraphFont"/>
+    <w:link w:val="Heading5"/>
+    <w:uiPriority w:val="9"/>
+    <w:semiHidden/>
+    <w:rsid w:val="00A10FD9"/>
     <w:rPr>
       <w:rFonts w:eastAsiaTheme="majorEastAsia" w:cstheme="majorBidi"/>
       <w:color w:val="0F4761" w:themeColor="accent1" w:themeShade="BF"/>
     </w:rPr>
   </w:style>
-  <w:style w:type="paragraph" w:styleId="Heading6">
-    <w:name w:val="heading 6"/>
-    <w:basedOn w:val="Normal"/>
-    <w:next w:val="BodyText"/>
-    <w:link w:val="Heading6Char"/>
-    <w:uiPriority w:val="9"/>
-    <w:semiHidden/>
-    <w:unhideWhenUsed/>
-    <w:qFormat/>
-    <w:rsid w:val="00A10FD9"/>
-    <w:pPr>
-      <w:keepNext/>
-      <w:keepLines/>
-      <w:spacing w:before="40" w:after="0"/>
-      <w:outlineLvl w:val="5"/>
-    </w:pPr>
+  <w:style w:type="character" w:customStyle="1" w:styleId="Heading6Char">
+    <w:name w:val="Heading 6 Char"/>
+    <w:basedOn w:val="DefaultParagraphFont"/>
+    <w:link w:val="Heading6"/>
+    <w:uiPriority w:val="9"/>
+    <w:semiHidden/>
+    <w:rsid w:val="00A10FD9"/>
     <w:rPr>
       <w:rFonts w:eastAsiaTheme="majorEastAsia" w:cstheme="majorBidi"/>
       <w:i/>
@@ -792,43 +949,25 @@
       <w:color w:val="595959" w:themeColor="text1" w:themeTint="A6"/>
     </w:rPr>
   </w:style>
-  <w:style w:type="paragraph" w:styleId="Heading7">
-    <w:name w:val="heading 7"/>
-    <w:basedOn w:val="Normal"/>
-    <w:next w:val="BodyText"/>
-    <w:link w:val="Heading7Char"/>
-    <w:uiPriority w:val="9"/>
-    <w:semiHidden/>
-    <w:unhideWhenUsed/>
-    <w:qFormat/>
-    <w:rsid w:val="00A10FD9"/>
-    <w:pPr>
-      <w:keepNext/>
-      <w:keepLines/>
-      <w:spacing w:before="40" w:after="0"/>
-      <w:outlineLvl w:val="6"/>
-    </w:pPr>
+  <w:style w:type="character" w:customStyle="1" w:styleId="Heading7Char">
+    <w:name w:val="Heading 7 Char"/>
+    <w:basedOn w:val="DefaultParagraphFont"/>
+    <w:link w:val="Heading7"/>
+    <w:uiPriority w:val="9"/>
+    <w:semiHidden/>
+    <w:rsid w:val="00A10FD9"/>
     <w:rPr>
       <w:rFonts w:eastAsiaTheme="majorEastAsia" w:cstheme="majorBidi"/>
       <w:color w:val="595959" w:themeColor="text1" w:themeTint="A6"/>
     </w:rPr>
   </w:style>
-  <w:style w:type="paragraph" w:styleId="Heading8">
-    <w:name w:val="heading 8"/>
-    <w:basedOn w:val="Normal"/>
-    <w:next w:val="BodyText"/>
-    <w:link w:val="Heading8Char"/>
-    <w:uiPriority w:val="9"/>
-    <w:semiHidden/>
-    <w:unhideWhenUsed/>
-    <w:qFormat/>
-    <w:rsid w:val="00A10FD9"/>
-    <w:pPr>
-      <w:keepNext/>
-      <w:keepLines/>
-      <w:spacing w:after="0"/>
-      <w:outlineLvl w:val="7"/>
-    </w:pPr>
+  <w:style w:type="character" w:customStyle="1" w:styleId="Heading8Char">
+    <w:name w:val="Heading 8 Char"/>
+    <w:basedOn w:val="DefaultParagraphFont"/>
+    <w:link w:val="Heading8"/>
+    <w:uiPriority w:val="9"/>
+    <w:semiHidden/>
+    <w:rsid w:val="00A10FD9"/>
     <w:rPr>
       <w:rFonts w:eastAsiaTheme="majorEastAsia" w:cstheme="majorBidi"/>
       <w:i/>
@@ -836,134 +975,6 @@
       <w:color w:val="272727" w:themeColor="text1" w:themeTint="D8"/>
     </w:rPr>
   </w:style>
-  <w:style w:type="paragraph" w:styleId="Heading9">
-    <w:name w:val="heading 9"/>
-    <w:basedOn w:val="Normal"/>
-    <w:next w:val="BodyText"/>
-    <w:link w:val="Heading9Char"/>
-    <w:uiPriority w:val="9"/>
-    <w:semiHidden/>
-    <w:unhideWhenUsed/>
-    <w:qFormat/>
-    <w:rsid w:val="00A10FD9"/>
-    <w:pPr>
-      <w:keepNext/>
-      <w:keepLines/>
-      <w:spacing w:after="0"/>
-      <w:outlineLvl w:val="8"/>
-    </w:pPr>
-    <w:rPr>
-      <w:rFonts w:eastAsiaTheme="majorEastAsia" w:cstheme="majorBidi"/>
-      <w:color w:val="272727" w:themeColor="text1" w:themeTint="D8"/>
-    </w:rPr>
-  </w:style>
-  <w:style w:type="character" w:customStyle="1" w:styleId="Heading1Char">
-    <w:name w:val="Heading 1 Char"/>
-    <w:basedOn w:val="DefaultParagraphFont"/>
-    <w:link w:val="Heading1"/>
-    <w:uiPriority w:val="9"/>
-    <w:rsid w:val="00A10FD9"/>
-    <w:rPr>
-      <w:rFonts w:asciiTheme="majorHAnsi" w:eastAsiaTheme="majorEastAsia" w:hAnsiTheme="majorHAnsi" w:cstheme="majorBidi"/>
-      <w:color w:val="0F4761" w:themeColor="accent1" w:themeShade="BF"/>
-      <w:sz w:val="40"/>
-      <w:szCs w:val="40"/>
-    </w:rPr>
-  </w:style>
-  <w:style w:type="character" w:customStyle="1" w:styleId="Heading2Char">
-    <w:name w:val="Heading 2 Char"/>
-    <w:basedOn w:val="DefaultParagraphFont"/>
-    <w:link w:val="Heading2"/>
-    <w:uiPriority w:val="9"/>
-    <w:semiHidden/>
-    <w:rsid w:val="00A10FD9"/>
-    <w:rPr>
-      <w:rFonts w:asciiTheme="majorHAnsi" w:eastAsiaTheme="majorEastAsia" w:hAnsiTheme="majorHAnsi" w:cstheme="majorBidi"/>
-      <w:color w:val="0F4761" w:themeColor="accent1" w:themeShade="BF"/>
-      <w:sz w:val="32"/>
-      <w:szCs w:val="32"/>
-    </w:rPr>
-  </w:style>
-  <w:style w:type="character" w:customStyle="1" w:styleId="Heading3Char">
-    <w:name w:val="Heading 3 Char"/>
-    <w:basedOn w:val="DefaultParagraphFont"/>
-    <w:link w:val="Heading3"/>
-    <w:uiPriority w:val="9"/>
-    <w:semiHidden/>
-    <w:rsid w:val="00A10FD9"/>
-    <w:rPr>
-      <w:rFonts w:eastAsiaTheme="majorEastAsia" w:cstheme="majorBidi"/>
-      <w:color w:val="0F4761" w:themeColor="accent1" w:themeShade="BF"/>
-      <w:sz w:val="28"/>
-      <w:szCs w:val="28"/>
-    </w:rPr>
-  </w:style>
-  <w:style w:type="character" w:customStyle="1" w:styleId="Heading4Char">
-    <w:name w:val="Heading 4 Char"/>
-    <w:basedOn w:val="DefaultParagraphFont"/>
-    <w:link w:val="Heading4"/>
-    <w:uiPriority w:val="9"/>
-    <w:semiHidden/>
-    <w:rsid w:val="00A10FD9"/>
-    <w:rPr>
-      <w:rFonts w:eastAsiaTheme="majorEastAsia" w:cstheme="majorBidi"/>
-      <w:i/>
-      <w:iCs/>
-      <w:color w:val="0F4761" w:themeColor="accent1" w:themeShade="BF"/>
-    </w:rPr>
-  </w:style>
-  <w:style w:type="character" w:customStyle="1" w:styleId="Heading5Char">
-    <w:name w:val="Heading 5 Char"/>
-    <w:basedOn w:val="DefaultParagraphFont"/>
-    <w:link w:val="Heading5"/>
-    <w:uiPriority w:val="9"/>
-    <w:semiHidden/>
-    <w:rsid w:val="00A10FD9"/>
-    <w:rPr>
-      <w:rFonts w:eastAsiaTheme="majorEastAsia" w:cstheme="majorBidi"/>
-      <w:color w:val="0F4761" w:themeColor="accent1" w:themeShade="BF"/>
-    </w:rPr>
-  </w:style>
-  <w:style w:type="character" w:customStyle="1" w:styleId="Heading6Char">
-    <w:name w:val="Heading 6 Char"/>
-    <w:basedOn w:val="DefaultParagraphFont"/>
-    <w:link w:val="Heading6"/>
-    <w:uiPriority w:val="9"/>
-    <w:semiHidden/>
-    <w:rsid w:val="00A10FD9"/>
-    <w:rPr>
-      <w:rFonts w:eastAsiaTheme="majorEastAsia" w:cstheme="majorBidi"/>
-      <w:i/>
-      <w:iCs/>
-      <w:color w:val="595959" w:themeColor="text1" w:themeTint="A6"/>
-    </w:rPr>
-  </w:style>
-  <w:style w:type="character" w:customStyle="1" w:styleId="Heading7Char">
-    <w:name w:val="Heading 7 Char"/>
-    <w:basedOn w:val="DefaultParagraphFont"/>
-    <w:link w:val="Heading7"/>
-    <w:uiPriority w:val="9"/>
-    <w:semiHidden/>
-    <w:rsid w:val="00A10FD9"/>
-    <w:rPr>
-      <w:rFonts w:eastAsiaTheme="majorEastAsia" w:cstheme="majorBidi"/>
-      <w:color w:val="595959" w:themeColor="text1" w:themeTint="A6"/>
-    </w:rPr>
-  </w:style>
-  <w:style w:type="character" w:customStyle="1" w:styleId="Heading8Char">
-    <w:name w:val="Heading 8 Char"/>
-    <w:basedOn w:val="DefaultParagraphFont"/>
-    <w:link w:val="Heading8"/>
-    <w:uiPriority w:val="9"/>
-    <w:semiHidden/>
-    <w:rsid w:val="00A10FD9"/>
-    <w:rPr>
-      <w:rFonts w:eastAsiaTheme="majorEastAsia" w:cstheme="majorBidi"/>
-      <w:i/>
-      <w:iCs/>
-      <w:color w:val="272727" w:themeColor="text1" w:themeTint="D8"/>
-    </w:rPr>
-  </w:style>
   <w:style w:type="character" w:customStyle="1" w:styleId="Heading9Char">
     <w:name w:val="Heading 9 Char"/>
     <w:basedOn w:val="DefaultParagraphFont"/>
@@ -1021,19 +1032,28 @@
     <w:qFormat/>
     <w:tblPr>
       <w:tblInd w:w="0" w:type="dxa"/>
+      <w:tblBorders>
+        <w:top w:val="single" w:sz="4" w:space="0" w:color="A6A6A6"/>
+        <w:left w:val="single" w:sz="4" w:space="0" w:color="A6A6A6"/>
+        <w:bottom w:val="single" w:sz="4" w:space="0" w:color="A6A6A6"/>
+        <w:right w:val="single" w:sz="4" w:space="0" w:color="A6A6A6"/>
+        <w:insideH w:val="single" w:sz="4" w:space="0" w:color="A6A6A6"/>
+        <w:insideV w:val="single" w:sz="4" w:space="0" w:color="A6A6A6"/>
+      </w:tblBorders>
       <w:tblCellMar>
-        <w:top w:w="0" w:type="dxa"/>
-        <w:left w:w="108" w:type="dxa"/>
-        <w:bottom w:w="0" w:type="dxa"/>
-        <w:right w:w="108" w:type="dxa"/>
+        <w:top w:w="40" w:type="dxa"/>
+        <w:left w:w="80" w:type="dxa"/>
+        <w:bottom w:w="40" w:type="dxa"/>
+        <w:right w:w="80" w:type="dxa"/>
       </w:tblCellMar>
     </w:tblPr>
     <w:tblStylePr w:type="firstRow">
+      <w:rPr>
+        <w:b/>
+        <w:color w:val="0B2A4A"/>
+      </w:rPr>
       <w:tcPr>
-        <w:tcBorders>
-          <w:bottom w:val="single"/>
-        </w:tcBorders>
-        <w:vAlign w:val="bottom"/>
+        <w:shd w:val="clear" w:color="auto" w:fill="E8EDF3"/>
       </w:tcPr>
     </w:tblStylePr>
   </w:style>

</xml_diff>

<commit_message>
FYC-23 : applique la charte choisie par le groupe
Arial 11 interligne 1,3, titres noirs numérotés avec niveau 1 en
capitales, accent bleu pétrole sur les liens et citations, code en
JetBrains Mono, tableaux bordés avec en-tête grise et lignes alternées,
texte de tableau 9 pt, page de titre à gauche.

Co-Authored-By: Claude Fable 5.1 <noreply@anthropic.com>
Claude-Session: https://claude.ai/code/session_014GLS1vnL6C5svPjRXKgnbw
</commit_message>
<xml_diff>
--- a/charte/reference.docx
+++ b/charte/reference.docx
@@ -493,7 +493,7 @@
     </w:rPrDefault>
     <w:pPrDefault>
       <w:pPr>
-        <w:spacing w:after="200"/>
+        <w:spacing w:after="200" w:line="312" w:lineRule="auto"/>
       </w:pPr>
     </w:pPrDefault>
   </w:docDefaults>
@@ -525,8 +525,8 @@
       <w:spacing w:before="36" w:after="36"/>
     </w:pPr>
     <w:rPr>
-      <w:sz w:val="20"/>
-      <w:szCs w:val="20"/>
+      <w:sz w:val="18"/>
+      <w:szCs w:val="18"/>
     </w:rPr>
   </w:style>
   <w:style w:type="paragraph" w:styleId="Title">
@@ -540,12 +540,12 @@
     <w:pPr>
       <w:spacing w:after="80" w:line="240" w:lineRule="auto"/>
       <w:contextualSpacing/>
-      <w:jc w:val="center"/>
+      <w:jc w:val="left"/>
     </w:pPr>
     <w:rPr>
       <w:rFonts w:ascii="Arial" w:hAnsi="Arial" w:eastAsia="Arial" w:cs="Arial"/>
       <w:b/>
-      <w:color w:val="0B2A4A"/>
+      <w:color w:val="111111"/>
       <w:sz w:val="40"/>
       <w:szCs w:val="40"/>
     </w:rPr>
@@ -681,7 +681,9 @@
     <w:rPr>
       <w:rFonts w:ascii="Arial" w:hAnsi="Arial" w:eastAsia="Arial" w:cs="Arial"/>
       <w:b/>
-      <w:color w:val="0B2A4A"/>
+      <w:caps/>
+      <w:spacing w:val="10"/>
+      <w:color w:val="111111"/>
       <w:sz w:val="32"/>
       <w:szCs w:val="32"/>
     </w:rPr>
@@ -705,7 +707,7 @@
     <w:rPr>
       <w:rFonts w:ascii="Arial" w:hAnsi="Arial" w:eastAsia="Arial" w:cs="Arial"/>
       <w:b/>
-      <w:color w:val="0B2A4A"/>
+      <w:color w:val="111111"/>
       <w:sz w:val="26"/>
       <w:szCs w:val="26"/>
     </w:rPr>
@@ -729,7 +731,7 @@
     <w:rPr>
       <w:rFonts w:ascii="Arial" w:hAnsi="Arial" w:eastAsia="Arial" w:cs="Arial"/>
       <w:b/>
-      <w:color w:val="0B2A4A"/>
+      <w:color w:val="111111"/>
       <w:sz w:val="22"/>
       <w:szCs w:val="22"/>
     </w:rPr>
@@ -754,7 +756,7 @@
       <w:rFonts w:ascii="Arial" w:hAnsi="Arial" w:eastAsia="Arial" w:cs="Arial"/>
       <w:b/>
       <w:i/>
-      <w:color w:val="0B2A4A"/>
+      <w:color w:val="111111"/>
       <w:sz w:val="22"/>
       <w:szCs w:val="22"/>
     </w:rPr>
@@ -995,6 +997,9 @@
     <w:unhideWhenUsed/>
     <w:qFormat/>
     <w:pPr>
+      <w:pBdr>
+        <w:left w:val="single" w:sz="12" w:space="8" w:color="14526D"/>
+      </w:pBdr>
       <w:spacing w:before="100" w:after="100"/>
       <w:ind w:firstLine="0" w:left="480" w:right="480"/>
     </w:pPr>
@@ -1033,12 +1038,12 @@
     <w:tblPr>
       <w:tblInd w:w="0" w:type="dxa"/>
       <w:tblBorders>
-        <w:top w:val="single" w:sz="4" w:space="0" w:color="A6A6A6"/>
-        <w:left w:val="single" w:sz="4" w:space="0" w:color="A6A6A6"/>
-        <w:bottom w:val="single" w:sz="4" w:space="0" w:color="A6A6A6"/>
-        <w:right w:val="single" w:sz="4" w:space="0" w:color="A6A6A6"/>
-        <w:insideH w:val="single" w:sz="4" w:space="0" w:color="A6A6A6"/>
-        <w:insideV w:val="single" w:sz="4" w:space="0" w:color="A6A6A6"/>
+        <w:top w:val="single" w:sz="4" w:space="0" w:color="999999"/>
+        <w:left w:val="single" w:sz="4" w:space="0" w:color="999999"/>
+        <w:bottom w:val="single" w:sz="4" w:space="0" w:color="999999"/>
+        <w:right w:val="single" w:sz="4" w:space="0" w:color="999999"/>
+        <w:insideH w:val="single" w:sz="4" w:space="0" w:color="999999"/>
+        <w:insideV w:val="single" w:sz="4" w:space="0" w:color="999999"/>
       </w:tblBorders>
       <w:tblCellMar>
         <w:top w:w="40" w:type="dxa"/>
@@ -1050,10 +1055,15 @@
     <w:tblStylePr w:type="firstRow">
       <w:rPr>
         <w:b/>
-        <w:color w:val="0B2A4A"/>
+        <w:color w:val="111111"/>
       </w:rPr>
       <w:tcPr>
-        <w:shd w:val="clear" w:color="auto" w:fill="E8EDF3"/>
+        <w:shd w:val="clear" w:color="auto" w:fill="EFEFEF"/>
+      </w:tcPr>
+    </w:tblStylePr>
+    <w:tblStylePr w:type="band2Horz">
+      <w:tcPr>
+        <w:shd w:val="clear" w:color="auto" w:fill="F5F7F9"/>
       </w:tcPr>
     </w:tblStylePr>
   </w:style>
@@ -1116,7 +1126,7 @@
     <w:name w:val="Verbatim Char"/>
     <w:basedOn w:val="BodyTextChar"/>
     <w:rPr>
-      <w:rFonts w:ascii="Consolas" w:hAnsi="Consolas"/>
+      <w:rFonts w:ascii="JetBrains Mono" w:hAnsi="JetBrains Mono" w:eastAsia="JetBrains Mono" w:cs="JetBrains Mono"/>
       <w:sz w:val="22"/>
     </w:rPr>
   </w:style>
@@ -1135,7 +1145,7 @@
     <w:name w:val="Hyperlink"/>
     <w:basedOn w:val="BodyTextChar"/>
     <w:rPr>
-      <w:color w:val="4F81BD" w:themeColor="accent1"/>
+      <w:color w:val="14526D"/>
     </w:rPr>
   </w:style>
   <w:style w:type="paragraph" w:styleId="TOCHeading">

</xml_diff>

<commit_message>
FYC-23 : sommaire en français avec numéros de page alignés à droite
Titre « Sommaire » via toc-title, styles TOC 1 à 3 avec taquet droit et
points de suite, titre du sommaire aligné sur le style Titre 1.

Co-Authored-By: Claude Fable 5.1 <noreply@anthropic.com>
Claude-Session: https://claude.ai/code/session_014GLS1vnL6C5svPjRXKgnbw
</commit_message>
<xml_diff>
--- a/charte/reference.docx
+++ b/charte/reference.docx
@@ -1156,15 +1156,54 @@
     <w:unhideWhenUsed/>
     <w:qFormat/>
     <w:pPr>
-      <w:spacing w:before="240" w:line="259" w:lineRule="auto"/>
+      <w:spacing w:before="240" w:after="120"/>
       <w:outlineLvl w:val="9"/>
     </w:pPr>
-    <w:rPr>
-      <w:rFonts w:asciiTheme="majorHAnsi" w:eastAsiaTheme="majorEastAsia" w:hAnsiTheme="majorHAnsi" w:cstheme="majorBidi"/>
-      <w:b w:val="0"/>
-      <w:bCs w:val="0"/>
-      <w:color w:val="365F91" w:themeColor="accent1" w:themeShade="BF"/>
-    </w:rPr>
+  </w:style>
+  <w:style w:type="paragraph" w:styleId="TOC1">
+    <w:name w:val="toc 1"/>
+    <w:basedOn w:val="Normal"/>
+    <w:next w:val="Normal"/>
+    <w:uiPriority w:val="39"/>
+    <w:unhideWhenUsed/>
+    <w:pPr>
+      <w:tabs>
+        <w:tab w:val="right" w:leader="dot" w:pos="9350"/>
+      </w:tabs>
+      <w:spacing w:before="120" w:after="0" w:line="276" w:lineRule="auto"/>
+      <w:ind w:left="0"/>
+    </w:pPr>
+    <w:rPr>
+      <w:b/>
+    </w:rPr>
+  </w:style>
+  <w:style w:type="paragraph" w:styleId="TOC2">
+    <w:name w:val="toc 2"/>
+    <w:basedOn w:val="Normal"/>
+    <w:next w:val="Normal"/>
+    <w:uiPriority w:val="39"/>
+    <w:unhideWhenUsed/>
+    <w:pPr>
+      <w:tabs>
+        <w:tab w:val="right" w:leader="dot" w:pos="9350"/>
+      </w:tabs>
+      <w:spacing w:before="40" w:after="0" w:line="276" w:lineRule="auto"/>
+      <w:ind w:left="220"/>
+    </w:pPr>
+  </w:style>
+  <w:style w:type="paragraph" w:styleId="TOC3">
+    <w:name w:val="toc 3"/>
+    <w:basedOn w:val="Normal"/>
+    <w:next w:val="Normal"/>
+    <w:uiPriority w:val="39"/>
+    <w:unhideWhenUsed/>
+    <w:pPr>
+      <w:tabs>
+        <w:tab w:val="right" w:leader="dot" w:pos="9350"/>
+      </w:tabs>
+      <w:spacing w:before="0" w:after="0" w:line="276" w:lineRule="auto"/>
+      <w:ind w:left="440"/>
+    </w:pPr>
   </w:style>
 </w:styles>
 </file>

</xml_diff>